<commit_message>
Deploy preview for PR 649 🛫
</commit_message>
<xml_diff>
--- a/pr-preview/pr-649/vignettes/articles/scrubTyphus_example.docx
+++ b/pr-preview/pr-649/vignettes/articles/scrubTyphus_example.docx
@@ -505,7 +505,34 @@
         <w:t xml:space="preserve"> </w:t>
       </w:r>
       <w:r>
-        <w:t xml:space="preserve">on Open Science Framework (OSF). We will pull this data directly into our R environment.</w:t>
+        <w:t xml:space="preserve">on Open Science Framework (OSF).</w:t>
+      </w:r>
+      <w:r>
+        <w:t xml:space="preserve"> </w:t>
+      </w:r>
+      <w:r>
+        <w:t xml:space="preserve">This vignette reads local, vendored copies of that data instead of fetching them at render time, so the documentation build doesn’t depend on OSF’s own availability — see</w:t>
+      </w:r>
+      <w:r>
+        <w:t xml:space="preserve"> </w:t>
+      </w:r>
+      <w:r>
+        <w:rPr>
+          <w:rStyle w:val="VerbatimChar"/>
+        </w:rPr>
+        <w:t xml:space="preserve">vignettes/precomputed/osf/README.md</w:t>
+      </w:r>
+      <w:r>
+        <w:t xml:space="preserve"> </w:t>
+      </w:r>
+      <w:r>
+        <w:t xml:space="preserve">for why and how to refresh them.</w:t>
+      </w:r>
+      <w:r>
+        <w:t xml:space="preserve"> </w:t>
+      </w:r>
+      <w:r>
+        <w:t xml:space="preserve">When adapting this code to your own analysis, replace the vendored paths below with the OSF download URL (or your own local file).</w:t>
       </w:r>
     </w:p>
     <w:bookmarkStart w:id="18" w:name="X1714420ab9e2734f8369f5ee70a749859cd59dc"/>
@@ -533,19 +560,7 @@
         <w:rPr>
           <w:rStyle w:val="CommentTok"/>
         </w:rPr>
-        <w:t xml:space="preserve"># Longitudinal antibody parameters, vendored from OSF (osf.io/u5gxh) --- see</w:t>
-      </w:r>
-      <w:r>
-        <w:br/>
-      </w:r>
-      <w:r>
-        <w:rPr>
-          <w:rStyle w:val="CommentTok"/>
-        </w:rPr>
-        <w:t xml:space="preserve"># ../precomputed/osf/README.md for why and how to refresh.</w:t>
-      </w:r>
-      <w:r>
-        <w:br/>
+        <w:t xml:space="preserve"># Vendored from OSF (osf.io/u5gxh).</w:t>
       </w:r>
       <w:r>
         <w:br/>
@@ -770,16 +785,7 @@
         <w:rPr>
           <w:rStyle w:val="CommentTok"/>
         </w:rPr>
-        <w:t xml:space="preserve"># Cross-sectional data, vendored from OSF (osf.io/h5js4); renamed to the</w:t>
-      </w:r>
-      <w:r>
-        <w:br/>
-      </w:r>
-      <w:r>
-        <w:rPr>
-          <w:rStyle w:val="CommentTok"/>
-        </w:rPr>
-        <w:t xml:space="preserve"># required variable names.</w:t>
+        <w:t xml:space="preserve"># Vendored from OSF (osf.io/h5js4); renamed to the required variable names.</w:t>
       </w:r>
       <w:r>
         <w:br/>

</xml_diff>